<commit_message>
Update published course materials
</commit_message>
<xml_diff>
--- a/PUBLISHED/biol-1/ALL_FILES/BIOL-1_Spring-2026_Syllabus.docx
+++ b/PUBLISHED/biol-1/ALL_FILES/BIOL-1_Spring-2026_Syllabus.docx
@@ -3,38 +3,208 @@
 <w:document xmlns:wpc="http://schemas.microsoft.com/office/word/2010/wordprocessingCanvas" xmlns:mo="http://schemas.microsoft.com/office/mac/office/2008/main" xmlns:mc="http://schemas.openxmlformats.org/markup-compatibility/2006" xmlns:mv="urn:schemas-microsoft-com:mac:vml" xmlns:o="urn:schemas-microsoft-com:office:office" xmlns:r="http://schemas.openxmlformats.org/officeDocument/2006/relationships" xmlns:m="http://schemas.openxmlformats.org/officeDocument/2006/math" xmlns:v="urn:schemas-microsoft-com:vml" xmlns:wp14="http://schemas.microsoft.com/office/word/2010/wordprocessingDrawing" xmlns:wp="http://schemas.openxmlformats.org/drawingml/2006/wordprocessingDrawing" xmlns:w10="urn:schemas-microsoft-com:office:word" xmlns:w="http://schemas.openxmlformats.org/wordprocessingml/2006/main" xmlns:w14="http://schemas.microsoft.com/office/word/2010/wordml" xmlns:wpg="http://schemas.microsoft.com/office/word/2010/wordprocessingGroup" xmlns:wpi="http://schemas.microsoft.com/office/word/2010/wordprocessingInk" xmlns:wne="http://schemas.microsoft.com/office/word/2006/wordml" xmlns:wps="http://schemas.microsoft.com/office/word/2010/wordprocessingShape" mc:Ignorable="w14 wp14">
   <w:body>
     <w:p>
+      <w:pPr>
+        <w:pStyle w:val="Heading1"/>
+      </w:pPr>
       <w:r>
         <w:t>Syllabus for BIOL-1: General Biology</w:t>
       </w:r>
     </w:p>
     <w:p>
+      <w:pPr>
+        <w:pStyle w:val="Heading2"/>
+      </w:pPr>
       <w:r>
         <w:t>College of the Redwoods</w:t>
       </w:r>
     </w:p>
     <w:p>
+      <w:pPr>
+        <w:pStyle w:val="Heading2"/>
+      </w:pPr>
       <w:r>
         <w:t>Course Information</w:t>
       </w:r>
     </w:p>
     <w:p>
       <w:r>
-        <w:t>Semester &amp; Year : Spring 2026  Course ID and Section number : BIOL-1-D8901 (058901)  Instructor's name : Daniel Friedman  Contact : Contact the instructor through Canvas.  Day and time of required meetings :  Lecture – Monday 05:30PM - 08:40PM  Lab - Wednesday 05:30PM - 08:40PM  Location : Pelican Bay D Yard  Number of exams : 4  Course units : 4   Catalog Description</w:t>
+        <w:t xml:space="preserve">• </w:t>
+      </w:r>
+      <w:r>
+        <w:rPr>
+          <w:b/>
+        </w:rPr>
+        <w:t>Semester &amp; Year</w:t>
+      </w:r>
+      <w:r>
+        <w:t>: Spring 2026</w:t>
       </w:r>
     </w:p>
     <w:p>
       <w:r>
-        <w:t>An introductory course in life science dealing with basic biological concepts including molecular and cell biology, metabolism, heredity, evolution, ecology, natural history, and biodiversity.</w:t>
+        <w:t xml:space="preserve">• </w:t>
+      </w:r>
+      <w:r>
+        <w:rPr>
+          <w:b/>
+        </w:rPr>
+        <w:t>Course ID and Section number</w:t>
+      </w:r>
+      <w:r>
+        <w:t>: BIOL-1-D8901 (058901)</w:t>
       </w:r>
     </w:p>
     <w:p>
+      <w:r>
+        <w:t xml:space="preserve">• </w:t>
+      </w:r>
+      <w:r>
+        <w:rPr>
+          <w:b/>
+        </w:rPr>
+        <w:t>Instructor's name</w:t>
+      </w:r>
+      <w:r>
+        <w:t>: Daniel Friedman</w:t>
+      </w:r>
+    </w:p>
+    <w:p>
+      <w:r>
+        <w:t xml:space="preserve">• </w:t>
+      </w:r>
+      <w:r>
+        <w:rPr>
+          <w:b/>
+        </w:rPr>
+        <w:t>Contact</w:t>
+      </w:r>
+      <w:r>
+        <w:t>: Contact the instructor through Canvas.</w:t>
+      </w:r>
+    </w:p>
+    <w:p>
+      <w:r>
+        <w:t xml:space="preserve">• </w:t>
+      </w:r>
+      <w:r>
+        <w:rPr>
+          <w:b/>
+        </w:rPr>
+        <w:t>Day and time of required meetings</w:t>
+      </w:r>
+      <w:r>
+        <w:t xml:space="preserve">: </w:t>
+      </w:r>
+    </w:p>
+    <w:p>
+      <w:r>
+        <w:t xml:space="preserve">• </w:t>
+      </w:r>
+      <w:r>
+        <w:t>Lecture – Monday 05:30PM - 08:40PM</w:t>
+      </w:r>
+    </w:p>
+    <w:p>
+      <w:r>
+        <w:t xml:space="preserve">• </w:t>
+      </w:r>
+      <w:r>
+        <w:t>Lab - Wednesday 05:30PM - 08:40PM</w:t>
+      </w:r>
+    </w:p>
+    <w:p>
+      <w:r>
+        <w:t xml:space="preserve">• </w:t>
+      </w:r>
+      <w:r>
+        <w:rPr>
+          <w:b/>
+        </w:rPr>
+        <w:t>Location</w:t>
+      </w:r>
+      <w:r>
+        <w:t>: Pelican Bay D Yard</w:t>
+      </w:r>
+    </w:p>
+    <w:p>
+      <w:r>
+        <w:t xml:space="preserve">• </w:t>
+      </w:r>
+      <w:r>
+        <w:rPr>
+          <w:b/>
+        </w:rPr>
+        <w:t>Number of exams</w:t>
+      </w:r>
+      <w:r>
+        <w:t>: 4</w:t>
+      </w:r>
+    </w:p>
+    <w:p>
+      <w:r>
+        <w:t xml:space="preserve">• </w:t>
+      </w:r>
+      <w:r>
+        <w:rPr>
+          <w:b/>
+        </w:rPr>
+        <w:t>Course units</w:t>
+      </w:r>
+      <w:r>
+        <w:t>: 4</w:t>
+      </w:r>
+    </w:p>
+    <w:p>
+      <w:pPr>
+        <w:pStyle w:val="Heading2"/>
+      </w:pPr>
+      <w:r>
+        <w:t>Catalog Description</w:t>
+      </w:r>
+    </w:p>
+    <w:p>
+      <w:r>
+        <w:t xml:space="preserve">An introductory course in life science dealing with basic biological concepts including molecular and cell biology, metabolism, heredity, evolution, ecology, natural history, and biodiversity. </w:t>
+      </w:r>
+    </w:p>
+    <w:p>
+      <w:pPr>
+        <w:pStyle w:val="Heading2"/>
+      </w:pPr>
       <w:r>
         <w:t>Course Student Learning Outcomes</w:t>
       </w:r>
     </w:p>
     <w:p>
       <w:r>
-        <w:t>Apply the process of science to critically evaluate observable biological phenomenon.  Describe attributes of life and explain how cells fulfill these characteristics.  Relate the mechanisms of evolutionary change to the production of biological diversity.   Prerequisites/Corequisites/Recommended Preparation</w:t>
+        <w:t xml:space="preserve">1. </w:t>
+      </w:r>
+      <w:r>
+        <w:t>Apply the process of science to critically evaluate observable biological phenomenon.</w:t>
+      </w:r>
+    </w:p>
+    <w:p>
+      <w:r>
+        <w:t xml:space="preserve">2. </w:t>
+      </w:r>
+      <w:r>
+        <w:t>Describe attributes of life and explain how cells fulfill these characteristics.</w:t>
+      </w:r>
+    </w:p>
+    <w:p>
+      <w:r>
+        <w:t xml:space="preserve">3. </w:t>
+      </w:r>
+      <w:r>
+        <w:t>Relate the mechanisms of evolutionary change to the production of biological diversity.</w:t>
+      </w:r>
+    </w:p>
+    <w:p>
+      <w:pPr>
+        <w:pStyle w:val="Heading2"/>
+      </w:pPr>
+      <w:r>
+        <w:t>Prerequisites/Corequisites/Recommended Preparation</w:t>
       </w:r>
     </w:p>
     <w:p>
@@ -43,6 +213,9 @@
       </w:r>
     </w:p>
     <w:p>
+      <w:pPr>
+        <w:pStyle w:val="Heading2"/>
+      </w:pPr>
       <w:r>
         <w:t>Educational Accessibility &amp; Support</w:t>
       </w:r>
@@ -54,10 +227,59 @@
     </w:p>
     <w:p>
       <w:r>
-        <w:t>Mental health conditions such as depression, anxiety, PTSD, bipolar disorder, and ADHD  Common ailments such as arthritis, asthma, diabetes, autoimmune disorders, and diseases  Temporary impairments such as a broken bone, recovery from significant surgery, or a pregnancy-related disability  A learning disability (such as dyslexia, reading comprehension), intellectual disability, autism, or acquired brain injury  Vision, hearing, or mobility challenges   Available services include extended test time, quiet testing environments, tutoring, counseling and advising, alternate formats of materials (such as audio books or E-texts), assistive technology, on-campus transportation, and more. If you believe you might benefit from disability- or health-related services and accommodations, please contact Disability Services and Programs for Students (DSPS). If you are unsure whether you qualify, please contact DSPS for a consultation: dsps@redwoods.edu .</w:t>
+        <w:t xml:space="preserve">• </w:t>
+      </w:r>
+      <w:r>
+        <w:t>Mental health conditions such as depression, anxiety, PTSD, bipolar disorder, and ADHD</w:t>
       </w:r>
     </w:p>
     <w:p>
+      <w:r>
+        <w:t xml:space="preserve">• </w:t>
+      </w:r>
+      <w:r>
+        <w:t>Common ailments such as arthritis, asthma, diabetes, autoimmune disorders, and diseases</w:t>
+      </w:r>
+    </w:p>
+    <w:p>
+      <w:r>
+        <w:t xml:space="preserve">• </w:t>
+      </w:r>
+      <w:r>
+        <w:t>Temporary impairments such as a broken bone, recovery from significant surgery, or a pregnancy-related disability</w:t>
+      </w:r>
+    </w:p>
+    <w:p>
+      <w:r>
+        <w:t xml:space="preserve">• </w:t>
+      </w:r>
+      <w:r>
+        <w:t>A learning disability (such as dyslexia, reading comprehension), intellectual disability, autism, or acquired brain injury</w:t>
+      </w:r>
+    </w:p>
+    <w:p>
+      <w:r>
+        <w:t xml:space="preserve">• </w:t>
+      </w:r>
+      <w:r>
+        <w:t>Vision, hearing, or mobility challenges</w:t>
+      </w:r>
+    </w:p>
+    <w:p>
+      <w:r>
+        <w:t xml:space="preserve">Available services include extended test time, quiet testing environments, tutoring, counseling and advising, alternate formats of materials (such as audio books or E-texts), assistive technology, on-campus transportation, and more. If you believe you might benefit from disability- or health-related services and accommodations, please contact Disability Services and Programs for Students (DSPS). If you are unsure whether you qualify, please contact DSPS for a consultation: </w:t>
+      </w:r>
+      <w:r>
+        <w:t>dsps@redwoods.edu</w:t>
+      </w:r>
+      <w:r>
+        <w:t>.</w:t>
+      </w:r>
+    </w:p>
+    <w:p>
+      <w:pPr>
+        <w:pStyle w:val="Heading2"/>
+      </w:pPr>
       <w:r>
         <w:t>Student Support Services</w:t>
       </w:r>
@@ -68,6 +290,9 @@
       </w:r>
     </w:p>
     <w:p>
+      <w:pPr>
+        <w:pStyle w:val="Heading2"/>
+      </w:pPr>
       <w:r>
         <w:t>Academic Dishonesty</w:t>
       </w:r>
@@ -78,6 +303,9 @@
       </w:r>
     </w:p>
     <w:p>
+      <w:pPr>
+        <w:pStyle w:val="Heading2"/>
+      </w:pPr>
       <w:r>
         <w:t>Respect and Disruptive Behavior</w:t>
       </w:r>

</xml_diff>